<commit_message>
Consolidated FR/NFR/SA/DE document: add a cover page and credit Hemanth's review input
Revised history now lists Hemanth Reddy Vangala's input for v1.1 and v1.2 under his name.
</commit_message>
<xml_diff>
--- a/docs/FR_SA_DE_CleanCAD_Fall26_v1_3.docx
+++ b/docs/FR_SA_DE_CleanCAD_Fall26_v1_3.docx
@@ -2,58 +2,346 @@
 <file path=word/document.xml><?xml version="1.0" encoding="utf-8"?>
 <w:document xmlns:wpc="http://schemas.microsoft.com/office/word/2010/wordprocessingCanvas" xmlns:mo="http://schemas.microsoft.com/office/mac/office/2008/main" xmlns:mc="http://schemas.openxmlformats.org/markup-compatibility/2006" xmlns:mv="urn:schemas-microsoft-com:mac:vml" xmlns:o="urn:schemas-microsoft-com:office:office" xmlns:r="http://schemas.openxmlformats.org/officeDocument/2006/relationships" xmlns:m="http://schemas.openxmlformats.org/officeDocument/2006/math" xmlns:v="urn:schemas-microsoft-com:vml" xmlns:wp14="http://schemas.microsoft.com/office/word/2010/wordprocessingDrawing" xmlns:wp="http://schemas.openxmlformats.org/drawingml/2006/wordprocessingDrawing" xmlns:w10="urn:schemas-microsoft-com:office:word" xmlns:w="http://schemas.openxmlformats.org/wordprocessingml/2006/main" xmlns:w14="http://schemas.microsoft.com/office/word/2010/wordml" xmlns:wpg="http://schemas.microsoft.com/office/word/2010/wordprocessingGroup" xmlns:wpi="http://schemas.microsoft.com/office/word/2010/wordprocessingInk" xmlns:wne="http://schemas.microsoft.com/office/word/2006/wordml" xmlns:wps="http://schemas.microsoft.com/office/word/2010/wordprocessingShape" mc:Ignorable="w14 wp14">
   <w:body>
+    <w:p/>
+    <w:p/>
+    <w:p/>
     <w:p>
+      <w:pPr>
+        <w:spacing w:after="40"/>
+        <w:jc w:val="center"/>
+      </w:pPr>
       <w:r>
         <w:rPr>
           <w:b/>
           <w:color w:val="1F3354"/>
-          <w:sz w:val="36"/>
+          <w:sz w:val="68"/>
         </w:rPr>
-        <w:t>Functional &amp; Non-Functional Requirements, System Architecture and Development Environment</w:t>
-      </w:r>
-    </w:p>
-    <w:p>
-      <w:r>
-        <w:rPr>
-          <w:b/>
-        </w:rPr>
-        <w:t xml:space="preserve">Project Name: </w:t>
-      </w:r>
-      <w:r>
-        <w:t>Mold-Part Defeaturing</w:t>
-      </w:r>
-    </w:p>
-    <w:p>
-      <w:r>
-        <w:rPr>
-          <w:b/>
-        </w:rPr>
-        <w:t xml:space="preserve">Team Name: </w:t>
-      </w:r>
-      <w:r>
         <w:t>CleanCAD</w:t>
       </w:r>
     </w:p>
     <w:p>
+      <w:pPr>
+        <w:spacing w:after="600"/>
+        <w:jc w:val="center"/>
+      </w:pPr>
+      <w:r>
+        <w:rPr>
+          <w:b w:val="0"/>
+          <w:color w:val="555555"/>
+          <w:sz w:val="30"/>
+        </w:rPr>
+        <w:t>AI-based Mold/Part Defeaturing</w:t>
+      </w:r>
+    </w:p>
+    <w:p>
+      <w:pPr>
+        <w:spacing w:after="0"/>
+        <w:jc w:val="center"/>
+      </w:pPr>
       <w:r>
         <w:rPr>
           <w:b/>
+          <w:color w:val="1F3354"/>
+          <w:sz w:val="42"/>
         </w:rPr>
-        <w:t xml:space="preserve">Team members: </w:t>
-      </w:r>
-      <w:r>
-        <w:t>Junoh Lee (Team Lead), Hemanth Reddy Vangala, Aneela Tahir, Balcha Kidus Elias</w:t>
+        <w:t>Functional &amp; Non-Functional Requirements,</w:t>
       </w:r>
     </w:p>
     <w:p>
+      <w:pPr>
+        <w:spacing w:after="720"/>
+        <w:jc w:val="center"/>
+      </w:pPr>
       <w:r>
         <w:rPr>
           <w:b/>
+          <w:color w:val="1F3354"/>
+          <w:sz w:val="42"/>
         </w:rPr>
-        <w:t xml:space="preserve">File: </w:t>
+        <w:t>System Architecture and Development Environment</w:t>
       </w:r>
+    </w:p>
+    <w:tbl>
+      <w:tblPr>
+        <w:tblStyle w:val="TableGrid"/>
+        <w:tblLayout w:type="fixed"/>
+        <w:tblLook w:firstColumn="1" w:firstRow="1" w:lastColumn="0" w:lastRow="0" w:noHBand="0" w:noVBand="1" w:val="04A0"/>
+        <w:tblBorders>
+          <w:top w:val="single" w:sz="4" w:color="000000"/>
+          <w:left w:val="single" w:sz="4" w:color="000000"/>
+          <w:bottom w:val="single" w:sz="4" w:color="000000"/>
+          <w:right w:val="single" w:sz="4" w:color="000000"/>
+          <w:insideH w:val="single" w:sz="4" w:color="000000"/>
+          <w:insideV w:val="single" w:sz="4" w:color="000000"/>
+        </w:tblBorders>
+        <w:tblLayout w:type="fixed"/>
+        <w:tblW w:type="dxa" w:w="9936"/>
+      </w:tblPr>
+      <w:tblGrid>
+        <w:gridCol w:w="2448"/>
+        <w:gridCol w:w="7488"/>
+      </w:tblGrid>
+      <w:tr>
+        <w:tc>
+          <w:tcPr>
+            <w:tcW w:type="dxa" w:w="2448"/>
+            <w:shd w:val="clear" w:fill="EEEEEE"/>
+          </w:tcPr>
+          <w:p>
+            <w:r/>
+            <w:r>
+              <w:rPr>
+                <w:b/>
+                <w:sz w:val="21"/>
+              </w:rPr>
+              <w:t>Project Name</w:t>
+            </w:r>
+          </w:p>
+        </w:tc>
+        <w:tc>
+          <w:tcPr>
+            <w:tcW w:type="dxa" w:w="7488"/>
+          </w:tcPr>
+          <w:p>
+            <w:r/>
+            <w:r>
+              <w:rPr>
+                <w:sz w:val="21"/>
+              </w:rPr>
+              <w:t>Mold-Part Defeaturing</w:t>
+            </w:r>
+          </w:p>
+        </w:tc>
+      </w:tr>
+      <w:tr>
+        <w:tc>
+          <w:tcPr>
+            <w:tcW w:type="dxa" w:w="2448"/>
+            <w:shd w:val="clear" w:fill="EEEEEE"/>
+          </w:tcPr>
+          <w:p>
+            <w:r/>
+            <w:r>
+              <w:rPr>
+                <w:b/>
+                <w:sz w:val="21"/>
+              </w:rPr>
+              <w:t>Team Name</w:t>
+            </w:r>
+          </w:p>
+        </w:tc>
+        <w:tc>
+          <w:tcPr>
+            <w:tcW w:type="dxa" w:w="7488"/>
+          </w:tcPr>
+          <w:p>
+            <w:r/>
+            <w:r>
+              <w:rPr>
+                <w:sz w:val="21"/>
+              </w:rPr>
+              <w:t>CleanCAD</w:t>
+            </w:r>
+          </w:p>
+        </w:tc>
+      </w:tr>
+      <w:tr>
+        <w:tc>
+          <w:tcPr>
+            <w:tcW w:type="dxa" w:w="2448"/>
+            <w:shd w:val="clear" w:fill="EEEEEE"/>
+          </w:tcPr>
+          <w:p>
+            <w:r/>
+            <w:r>
+              <w:rPr>
+                <w:b/>
+                <w:sz w:val="21"/>
+              </w:rPr>
+              <w:t>Team Members</w:t>
+            </w:r>
+          </w:p>
+        </w:tc>
+        <w:tc>
+          <w:tcPr>
+            <w:tcW w:type="dxa" w:w="7488"/>
+          </w:tcPr>
+          <w:p>
+            <w:r/>
+            <w:r>
+              <w:rPr>
+                <w:sz w:val="21"/>
+              </w:rPr>
+              <w:t>Junoh Lee (Team Lead), Hemanth Reddy Vangala, Aneela Tahir, Balcha Kidus Elias</w:t>
+            </w:r>
+          </w:p>
+        </w:tc>
+      </w:tr>
+      <w:tr>
+        <w:tc>
+          <w:tcPr>
+            <w:tcW w:type="dxa" w:w="2448"/>
+            <w:shd w:val="clear" w:fill="EEEEEE"/>
+          </w:tcPr>
+          <w:p>
+            <w:r/>
+            <w:r>
+              <w:rPr>
+                <w:b/>
+                <w:sz w:val="21"/>
+              </w:rPr>
+              <w:t>Company Partner</w:t>
+            </w:r>
+          </w:p>
+        </w:tc>
+        <w:tc>
+          <w:tcPr>
+            <w:tcW w:type="dxa" w:w="7488"/>
+          </w:tcPr>
+          <w:p>
+            <w:r/>
+            <w:r>
+              <w:rPr>
+                <w:sz w:val="21"/>
+              </w:rPr>
+              <w:t>HP Printing Korea (mentor: Byoungho Yoo, CAE)</w:t>
+            </w:r>
+          </w:p>
+        </w:tc>
+      </w:tr>
+      <w:tr>
+        <w:tc>
+          <w:tcPr>
+            <w:tcW w:type="dxa" w:w="2448"/>
+            <w:shd w:val="clear" w:fill="EEEEEE"/>
+          </w:tcPr>
+          <w:p>
+            <w:r/>
+            <w:r>
+              <w:rPr>
+                <w:b/>
+                <w:sz w:val="21"/>
+              </w:rPr>
+              <w:t>Document Version</w:t>
+            </w:r>
+          </w:p>
+        </w:tc>
+        <w:tc>
+          <w:tcPr>
+            <w:tcW w:type="dxa" w:w="7488"/>
+          </w:tcPr>
+          <w:p>
+            <w:r/>
+            <w:r>
+              <w:rPr>
+                <w:sz w:val="21"/>
+              </w:rPr>
+              <w:t>1.3</w:t>
+            </w:r>
+          </w:p>
+        </w:tc>
+      </w:tr>
+      <w:tr>
+        <w:tc>
+          <w:tcPr>
+            <w:tcW w:type="dxa" w:w="2448"/>
+            <w:shd w:val="clear" w:fill="EEEEEE"/>
+          </w:tcPr>
+          <w:p>
+            <w:r/>
+            <w:r>
+              <w:rPr>
+                <w:b/>
+                <w:sz w:val="21"/>
+              </w:rPr>
+              <w:t>Date</w:t>
+            </w:r>
+          </w:p>
+        </w:tc>
+        <w:tc>
+          <w:tcPr>
+            <w:tcW w:type="dxa" w:w="7488"/>
+          </w:tcPr>
+          <w:p>
+            <w:r/>
+            <w:r>
+              <w:rPr>
+                <w:sz w:val="21"/>
+              </w:rPr>
+              <w:t>2026-10-08</w:t>
+            </w:r>
+          </w:p>
+        </w:tc>
+      </w:tr>
+      <w:tr>
+        <w:tc>
+          <w:tcPr>
+            <w:tcW w:type="dxa" w:w="2448"/>
+            <w:shd w:val="clear" w:fill="EEEEEE"/>
+          </w:tcPr>
+          <w:p>
+            <w:r/>
+            <w:r>
+              <w:rPr>
+                <w:b/>
+                <w:sz w:val="21"/>
+              </w:rPr>
+              <w:t>Status</w:t>
+            </w:r>
+          </w:p>
+        </w:tc>
+        <w:tc>
+          <w:tcPr>
+            <w:tcW w:type="dxa" w:w="7488"/>
+          </w:tcPr>
+          <w:p>
+            <w:r/>
+            <w:r>
+              <w:rPr>
+                <w:sz w:val="21"/>
+              </w:rPr>
+              <w:t>Draft for team review</w:t>
+            </w:r>
+          </w:p>
+        </w:tc>
+      </w:tr>
+      <w:tr>
+        <w:tc>
+          <w:tcPr>
+            <w:tcW w:type="dxa" w:w="2448"/>
+            <w:shd w:val="clear" w:fill="EEEEEE"/>
+          </w:tcPr>
+          <w:p>
+            <w:r/>
+            <w:r>
+              <w:rPr>
+                <w:b/>
+                <w:sz w:val="21"/>
+              </w:rPr>
+              <w:t>File</w:t>
+            </w:r>
+          </w:p>
+        </w:tc>
+        <w:tc>
+          <w:tcPr>
+            <w:tcW w:type="dxa" w:w="7488"/>
+          </w:tcPr>
+          <w:p>
+            <w:r/>
+            <w:r>
+              <w:rPr>
+                <w:sz w:val="21"/>
+              </w:rPr>
+              <w:t>FR_SA_DE_CleanCAD_Fall26_v1_3.docx</w:t>
+            </w:r>
+          </w:p>
+        </w:tc>
+      </w:tr>
+    </w:tbl>
+    <w:p/>
+    <w:p>
       <w:r>
-        <w:t>FR_SA_DE_CleanCAD_Fall26_v1_3.docx</w:t>
+        <w:br w:type="page"/>
       </w:r>
     </w:p>
     <w:p>
@@ -282,6 +570,64 @@
               <w:rPr>
                 <w:sz w:val="19"/>
               </w:rPr>
+              <w:t>Hemanth Reddy Vangala</w:t>
+            </w:r>
+          </w:p>
+        </w:tc>
+        <w:tc>
+          <w:tcPr>
+            <w:tcW w:type="dxa" w:w="1296"/>
+          </w:tcPr>
+          <w:p>
+            <w:r/>
+            <w:r>
+              <w:rPr>
+                <w:sz w:val="19"/>
+              </w:rPr>
+              <w:t>2026-10-08</w:t>
+            </w:r>
+          </w:p>
+        </w:tc>
+        <w:tc>
+          <w:tcPr>
+            <w:tcW w:type="dxa" w:w="5760"/>
+          </w:tcPr>
+          <w:p>
+            <w:r/>
+            <w:r>
+              <w:rPr>
+                <w:sz w:val="19"/>
+              </w:rPr>
+              <w:t>Review input for this version: pointed out that the requirement statements in Appendix A were cut short and that the System Architecture revision history was not visible; explained that the File Management Module stores the files on the engineer's PC and that no database is needed because only a few files are stored (4.7); noted that there are no criteria to measure mesh quality (FR-VAL-03); suggested dividing the development environment into hardware and software (5).</w:t>
+            </w:r>
+          </w:p>
+        </w:tc>
+        <w:tc>
+          <w:tcPr>
+            <w:tcW w:type="dxa" w:w="1152"/>
+          </w:tcPr>
+          <w:p>
+            <w:r/>
+            <w:r>
+              <w:rPr>
+                <w:sz w:val="19"/>
+              </w:rPr>
+              <w:t>1.1</w:t>
+            </w:r>
+          </w:p>
+        </w:tc>
+      </w:tr>
+      <w:tr>
+        <w:tc>
+          <w:tcPr>
+            <w:tcW w:type="dxa" w:w="1728"/>
+          </w:tcPr>
+          <w:p>
+            <w:r/>
+            <w:r>
+              <w:rPr>
+                <w:sz w:val="19"/>
+              </w:rPr>
               <w:t>Junoh Lee</w:t>
             </w:r>
           </w:p>
@@ -311,6 +657,64 @@
                 <w:sz w:val="19"/>
               </w:rPr>
               <w:t>Reviewed with Hemanth Reddy Vangala: FR-FEAT-05 reworded (no approval step inside the system; the HP engineer reviews the output and corrects mistakes manually); NFR-PERF-02 reworded (less time than an engineer working manually) and changed from Want to Must.</w:t>
+            </w:r>
+          </w:p>
+        </w:tc>
+        <w:tc>
+          <w:tcPr>
+            <w:tcW w:type="dxa" w:w="1152"/>
+          </w:tcPr>
+          <w:p>
+            <w:r/>
+            <w:r>
+              <w:rPr>
+                <w:sz w:val="19"/>
+              </w:rPr>
+              <w:t>1.2</w:t>
+            </w:r>
+          </w:p>
+        </w:tc>
+      </w:tr>
+      <w:tr>
+        <w:tc>
+          <w:tcPr>
+            <w:tcW w:type="dxa" w:w="1728"/>
+          </w:tcPr>
+          <w:p>
+            <w:r/>
+            <w:r>
+              <w:rPr>
+                <w:sz w:val="19"/>
+              </w:rPr>
+              <w:t>Hemanth Reddy Vangala</w:t>
+            </w:r>
+          </w:p>
+        </w:tc>
+        <w:tc>
+          <w:tcPr>
+            <w:tcW w:type="dxa" w:w="1296"/>
+          </w:tcPr>
+          <w:p>
+            <w:r/>
+            <w:r>
+              <w:rPr>
+                <w:sz w:val="19"/>
+              </w:rPr>
+              <w:t>2026-10-08</w:t>
+            </w:r>
+          </w:p>
+        </w:tc>
+        <w:tc>
+          <w:tcPr>
+            <w:tcW w:type="dxa" w:w="5760"/>
+          </w:tcPr>
+          <w:p>
+            <w:r/>
+            <w:r>
+              <w:rPr>
+                <w:sz w:val="19"/>
+              </w:rPr>
+              <w:t>Review input for this version: FR-FEAT-05 (as he understood the HP mentor, the system completes the work and HP handles mistakes afterwards, so no review step inside the system); confirmed the FR-FEAT-06 note; suggested the NFR-PERF-02 wording that the system should take less time than an engineer doing the work manually.</w:t>
             </w:r>
           </w:p>
         </w:tc>

</xml_diff>